<commit_message>
Fix Lucie sequence: Yannick is the owner, not the chef
Replace all 'Chef Yannick' references with 'the Chef' — Yannick
is the owner, not the head chef. Kitchen attribution preserved
without naming the wrong person.

Co-Authored-By: Claude Opus 4.6 (1M context) <noreply@anthropic.com>
</commit_message>
<xml_diff>
--- a/lucie-private-event-sales-sequence.docx
+++ b/lucie-private-event-sales-sequence.docx
@@ -687,7 +687,7 @@
                 <w:sz w:val="20"/>
                 <w:szCs w:val="20"/>
               </w:rPr>
-              <w:t xml:space="preserve">Custom tasting menu by Chef Yannick for every group.</w:t>
+              <w:t xml:space="preserve">Custom tasting menu by the Chef for every group.</w:t>
             </w:r>
           </w:p>
           <w:p>
@@ -2510,7 +2510,7 @@
                 <w:sz w:val="21"/>
                 <w:szCs w:val="21"/>
               </w:rPr>
-              <w:t xml:space="preserve">I wanted to share a bit about what makes a private event at Lucie different. Chef Yannick designs a fully customized tasting menu for every group — built around your preferences, dietary needs, and the season. No fixed packages, no generic set menus. From the moment your guests arrive to the moment they leave, every detail is tailored.</w:t>
+              <w:t xml:space="preserve">I wanted to share a bit about what makes a private event at Lucie different. The Chef designs a fully customized tasting menu for every group — built around your preferences, dietary needs, and the season. No fixed packages, no generic set menus. From the moment your guests arrive to the moment they leave, every detail is tailored.</w:t>
             </w:r>
           </w:p>
           <w:p>
@@ -2939,7 +2939,7 @@
                 <w:sz w:val="21"/>
                 <w:szCs w:val="21"/>
               </w:rPr>
-              <w:t xml:space="preserve">Because our space is intimate, we have extraordinary flexibility — the room transforms around your event, not the other way around. Chef Yannick, our sommelier, and I work together to design something that feels completely yours.</w:t>
+              <w:t xml:space="preserve">Because our space is intimate, we have extraordinary flexibility — the room transforms around your event, not the other way around. The Chef, our sommelier, and I work together to design something that feels completely yours.</w:t>
             </w:r>
           </w:p>
           <w:p>
@@ -3481,7 +3481,7 @@
                 <w:sz w:val="22"/>
                 <w:szCs w:val="22"/>
               </w:rPr>
-              <w:t xml:space="preserve">Here’s what Chef Yannick built for a recent group</w:t>
+              <w:t xml:space="preserve">Here’s what the Chef built for a recent group</w:t>
             </w:r>
           </w:p>
           <w:p>
@@ -3509,7 +3509,7 @@
                 <w:sz w:val="21"/>
                 <w:szCs w:val="21"/>
               </w:rPr>
-              <w:t xml:space="preserve">I thought you might like to see what a fully customized private event menu looks like at Lucie. Here’s one Chef Yannick designed for a recent corporate dinner of twelve:</w:t>
+              <w:t xml:space="preserve">I thought you might like to see what a fully customized private event menu looks like at Lucie. Here’s one the Chef designed for a recent corporate dinner of twelve:</w:t>
             </w:r>
           </w:p>
           <w:tbl>
@@ -4700,7 +4700,7 @@
                 <w:sz w:val="22"/>
                 <w:szCs w:val="22"/>
               </w:rPr>
-              <w:t xml:space="preserve">What’s inspiring Chef Yannick this season</w:t>
+              <w:t xml:space="preserve">What’s inspiring the Chef this season</w:t>
             </w:r>
           </w:p>
           <w:p>
@@ -4728,7 +4728,7 @@
                 <w:sz w:val="21"/>
                 <w:szCs w:val="21"/>
               </w:rPr>
-              <w:t xml:space="preserve">A quick note from the kitchen — Chef Yannick is working with some extraordinary ingredients right now: [2–3 seasonal specifics, e.g. “wild leeks foraged from Quebec, asparagus from the first local harvest, spring lamb from Elysian Fields”].</w:t>
+              <w:t xml:space="preserve">A quick note from the kitchen — the Chef is working with some extraordinary ingredients right now: [2–3 seasonal specifics, e.g. “wild leeks foraged from Quebec, asparagus from the first local harvest, spring lamb from Elysian Fields”].</w:t>
             </w:r>
           </w:p>
           <w:p>
@@ -5002,7 +5002,7 @@
                 <w:sz w:val="21"/>
                 <w:szCs w:val="21"/>
               </w:rPr>
-              <w:t xml:space="preserve">A partner at [type of firm] booked a dinner for 10 to celebrate the close of a major deal. Chef Yannick built a seven-course menu around the group’s preferences (two pescatarians, one nut allergy — every plate was different where it needed to be). Our sommelier ran a blind tasting between courses that had the table in stitches. And on the way out, the kitchen sent everyone off with a surprise canapé — a little parting gift that wasn’t on any menu.</w:t>
+              <w:t xml:space="preserve">A partner at [type of firm] booked a dinner for 10 to celebrate the close of a major deal. The Chef built a seven-course menu around the group’s preferences (two pescatarians, one nut allergy — every plate was different where it needed to be). Our sommelier ran a blind tasting between courses that had the table in stitches. And on the way out, the kitchen sent everyone off with a surprise canapé — a little parting gift that wasn’t on any menu.</w:t>
             </w:r>
           </w:p>
           <w:p>
@@ -5863,7 +5863,7 @@
                 <w:sz w:val="21"/>
                 <w:szCs w:val="21"/>
               </w:rPr>
-              <w:t xml:space="preserve">Here’s what makes a celebration at Lucie different: Chef Yannick builds the experience around you. A personalized tasting menu. Wine pairings selected for your table. A handwritten note on the menu if you’d like. No generic “birthday package” — just an evening designed with care.</w:t>
+              <w:t xml:space="preserve">Here’s what makes a celebration at Lucie different: the Chef builds the experience around you. A personalized tasting menu. Wine pairings selected for your table. A handwritten note on the menu if you’d like. No generic “birthday package” — just an evening designed with care.</w:t>
             </w:r>
           </w:p>
           <w:p>
@@ -6307,7 +6307,7 @@
                 <w:sz w:val="21"/>
                 <w:szCs w:val="21"/>
               </w:rPr>
-              <w:t xml:space="preserve">Every menu is seasonal and designed by Chef Yannick. Dietary accommodations are always welcome.</w:t>
+              <w:t xml:space="preserve">Every menu is seasonal and designed by the Chef. Dietary accommodations are always welcome.</w:t>
             </w:r>
           </w:p>
           <w:p>
@@ -7390,7 +7390,7 @@
                 <w:sz w:val="21"/>
                 <w:szCs w:val="21"/>
               </w:rPr>
-              <w:t xml:space="preserve">Every dish at Lucie starts with a conversation — between Chef Yannick, the season, and the producers he trusts.</w:t>
+              <w:t xml:space="preserve">Every dish at Lucie starts with a conversation — between the Chef, the season, and the producers he trusts.</w:t>
             </w:r>
           </w:p>
           <w:p>

</xml_diff>

<commit_message>
Gate SMS touches behind A2P verification (Phase 2)
A2P 10DLC not yet complete for Lucie. Email sequence now stands on
its own as Phase 1; SMS touches clearly flagged as Phase 2 throughout
(visual gated/dashed styling, 'PENDING A2P' timing labels, separate
phase callout, split Next Steps by phase).

Co-Authored-By: Claude Opus 4.6 (1M context) <noreply@anthropic.com>
</commit_message>
<xml_diff>
--- a/lucie-private-event-sales-sequence.docx
+++ b/lucie-private-event-sales-sequence.docx
@@ -104,6 +104,23 @@
       </w:r>
     </w:p>
     <w:p>
+      <w:pPr>
+        <w:spacing w:after="0" w:before="200"/>
+        <w:jc w:val="center"/>
+      </w:pPr>
+      <w:r>
+        <w:rPr>
+          <w:rFonts w:ascii="Inter" w:cs="Inter" w:eastAsia="Inter" w:hAnsi="Inter"/>
+          <w:i/>
+          <w:iCs/>
+          <w:color w:val="D4A574"/>
+          <w:sz w:val="18"/>
+          <w:szCs w:val="18"/>
+        </w:rPr>
+        <w:t xml:space="preserve">Email-first launch · SMS layer activates once A2P 10DLC clears (Phase 2)</w:t>
+      </w:r>
+    </w:p>
+    <w:p>
       <w:r>
         <w:br w:type="page"/>
       </w:r>
@@ -897,7 +914,21 @@
                 <w:sz w:val="20"/>
                 <w:szCs w:val="20"/>
               </w:rPr>
-              <w:t xml:space="preserve">Table Voice (AI phone, Yannick investor) can send texts — explore integration.</w:t>
+              <w:t xml:space="preserve">A2P 10DLC SMS not yet verified — email-only at launch.</w:t>
+            </w:r>
+          </w:p>
+          <w:p>
+            <w:pPr>
+              <w:spacing w:after="80"/>
+            </w:pPr>
+            <w:r>
+              <w:rPr>
+                <w:rFonts w:ascii="Inter" w:cs="Inter" w:eastAsia="Inter" w:hAnsi="Inter"/>
+                <w:color w:val="1A2A35"/>
+                <w:sz w:val="20"/>
+                <w:szCs w:val="20"/>
+              </w:rPr>
+              <w:t xml:space="preserve">Table Voice (AI phone, Yannick investor) can send texts — explore for Phase 2.</w:t>
             </w:r>
           </w:p>
           <w:p>
@@ -999,6 +1030,81 @@
         </w:tblBorders>
       </w:tblPr>
       <w:tblGrid>
+        <w:gridCol w:w="9360"/>
+      </w:tblGrid>
+      <w:tr>
+        <w:tc>
+          <w:tcPr>
+            <w:tcW w:type="dxa" w:w="9360"/>
+            <w:tcBorders>
+              <w:top w:val="none" w:sz="0"/>
+              <w:left w:val="single" w:color="D4A574" w:sz="12" w:space="0"/>
+              <w:bottom w:val="none" w:sz="0"/>
+              <w:right w:val="none" w:sz="0"/>
+            </w:tcBorders>
+            <w:shd w:fill="F5F0E8" w:val="clear"/>
+            <w:tcMar>
+              <w:top w:type="dxa" w:w="140"/>
+              <w:left w:type="dxa" w:w="180"/>
+              <w:bottom w:type="dxa" w:w="140"/>
+              <w:right w:type="dxa" w:w="180"/>
+            </w:tcMar>
+          </w:tcPr>
+          <w:p>
+            <w:pPr>
+              <w:spacing w:after="0"/>
+            </w:pPr>
+            <w:r>
+              <w:rPr>
+                <w:rFonts w:ascii="Inter" w:cs="Inter" w:eastAsia="Inter" w:hAnsi="Inter"/>
+                <w:b/>
+                <w:bCs/>
+                <w:color w:val="013349"/>
+                <w:sz w:val="21"/>
+                <w:szCs w:val="21"/>
+              </w:rPr>
+              <w:t xml:space="preserve">Two-phase rollout:</w:t>
+            </w:r>
+            <w:r>
+              <w:rPr>
+                <w:rFonts w:ascii="Inter" w:cs="Inter" w:eastAsia="Inter" w:hAnsi="Inter"/>
+                <w:color w:val="1A2A35"/>
+                <w:sz w:val="21"/>
+                <w:szCs w:val="21"/>
+              </w:rPr>
+              <w:t xml:space="preserve"> The email sequence stands on its own and launches now. SMS touches (shown as dashed cards throughout) are drafted but gated on A2P 10DLC verification. Email cadence has no dependency on SMS firing — each email does its job alone. Phase 2 activates SMS once A2P clears.</w:t>
+            </w:r>
+          </w:p>
+        </w:tc>
+      </w:tr>
+    </w:tbl>
+    <w:p>
+      <w:pPr>
+        <w:spacing w:after="240"/>
+      </w:pPr>
+      <w:r>
+        <w:rPr>
+          <w:rFonts w:ascii="Inter" w:cs="Inter" w:eastAsia="Inter" w:hAnsi="Inter"/>
+          <w:color w:val="1A2A35"/>
+          <w:sz w:val="22"/>
+          <w:szCs w:val="22"/>
+        </w:rPr>
+        <w:t xml:space="preserve"/>
+      </w:r>
+    </w:p>
+    <w:tbl>
+      <w:tblPr>
+        <w:tblW w:type="dxa" w:w="9360"/>
+        <w:tblBorders>
+          <w:top w:val="single" w:color="auto" w:sz="4"/>
+          <w:left w:val="single" w:color="auto" w:sz="4"/>
+          <w:bottom w:val="single" w:color="auto" w:sz="4"/>
+          <w:right w:val="single" w:color="auto" w:sz="4"/>
+          <w:insideH w:val="single" w:color="auto" w:sz="4"/>
+          <w:insideV w:val="single" w:color="auto" w:sz="4"/>
+        </w:tblBorders>
+      </w:tblPr>
+      <w:tblGrid>
         <w:gridCol w:w="600"/>
         <w:gridCol w:w="2600"/>
         <w:gridCol w:w="2200"/>
@@ -2156,7 +2262,7 @@
                 <w:sz w:val="18"/>
                 <w:szCs w:val="18"/>
               </w:rPr>
-              <w:t xml:space="preserve">Day 0 · Fires within 2 minutes of form submission</w:t>
+              <w:t xml:space="preserve">Day 0 · Fires within 2 minutes of form submission · PHASE 2 — PENDING A2P</w:t>
             </w:r>
           </w:p>
         </w:tc>
@@ -3995,7 +4101,7 @@
                 <w:sz w:val="18"/>
                 <w:szCs w:val="18"/>
               </w:rPr>
-              <w:t xml:space="preserve">Day 18 · Quick, casual</w:t>
+              <w:t xml:space="preserve">Day 18 · Quick, casual · PHASE 2 — PENDING A2P</w:t>
             </w:r>
           </w:p>
         </w:tc>
@@ -5571,7 +5677,7 @@
                 <w:sz w:val="18"/>
                 <w:szCs w:val="18"/>
               </w:rPr>
-              <w:t xml:space="preserve">Day 0 · Fires within 2 minutes</w:t>
+              <w:t xml:space="preserve">Day 0 · Fires within 2 minutes · PHASE 2 — PENDING A2P</w:t>
             </w:r>
           </w:p>
         </w:tc>
@@ -8226,7 +8332,7 @@
                 <w:sz w:val="19"/>
                 <w:szCs w:val="19"/>
               </w:rPr>
-              <w:t xml:space="preserve">SMS Channel</w:t>
+              <w:t xml:space="preserve">SMS Channel — Phase 2</w:t>
             </w:r>
           </w:p>
         </w:tc>
@@ -8258,7 +8364,7 @@
                 <w:sz w:val="19"/>
                 <w:szCs w:val="19"/>
               </w:rPr>
-              <w:t xml:space="preserve">Explore Table Voice integration first (Yannick’s investment, already handles texts). Fallback: provision a HighLevel number ($2/mo). Maggie to connect Kyle with Pascal.</w:t>
+              <w:t xml:space="preserve">A2P 10DLC verification pending. SMS touches are drafted and ready but do not launch with Phase 1. Parallel workstream: complete A2P registration via HighLevel (business name, EIN/BN, use-case docs) and explore Table Voice integration (Yannick’s investment, already handles texts). Maggie to connect Kyle with Pascal. Activate SMS once approved.</w:t>
             </w:r>
           </w:p>
         </w:tc>
@@ -9870,7 +9976,7 @@
           <w:sz w:val="22"/>
           <w:szCs w:val="22"/>
         </w:rPr>
-        <w:t xml:space="preserve">Maggie forwards the Perfect Venue CSV export (315 contacts)</w:t>
+        <w:t xml:space="preserve">PHASE 1 — Maggie forwards the Perfect Venue CSV export (315 contacts)</w:t>
       </w:r>
     </w:p>
     <w:p>
@@ -9889,7 +9995,7 @@
           <w:sz w:val="22"/>
           <w:szCs w:val="22"/>
         </w:rPr>
-        <w:t xml:space="preserve">Kyle deduplicates and imports into HighLevel</w:t>
+        <w:t xml:space="preserve">PHASE 1 — Kyle deduplicates and imports into HighLevel</w:t>
       </w:r>
     </w:p>
     <w:p>
@@ -9908,7 +10014,7 @@
           <w:sz w:val="22"/>
           <w:szCs w:val="22"/>
         </w:rPr>
-        <w:t xml:space="preserve">Connect with Pascal re: Table Voice SMS integration</w:t>
+        <w:t xml:space="preserve">PHASE 1 — Review sequence copy on Tuesday call</w:t>
       </w:r>
     </w:p>
     <w:p>
@@ -9927,7 +10033,7 @@
           <w:sz w:val="22"/>
           <w:szCs w:val="22"/>
         </w:rPr>
-        <w:t xml:space="preserve">Review sequence copy on Tuesday call</w:t>
+        <w:t xml:space="preserve">PHASE 1 — Launch Segment A email sequence first (highest value), then B &amp; C in the same week</w:t>
       </w:r>
     </w:p>
     <w:p>
@@ -9946,7 +10052,45 @@
           <w:sz w:val="22"/>
           <w:szCs w:val="22"/>
         </w:rPr>
-        <w:t xml:space="preserve">Launch Segment A first (highest value), then B &amp; C in the same week</w:t>
+        <w:t xml:space="preserve">PHASE 2 — Complete A2P 10DLC verification via HighLevel (in parallel with Phase 1 launch)</w:t>
+      </w:r>
+    </w:p>
+    <w:p>
+      <w:pPr>
+        <w:pStyle w:val="ListParagraph"/>
+        <w:numPr>
+          <w:ilvl w:val="0"/>
+          <w:numId w:val="2"/>
+        </w:numPr>
+        <w:spacing w:after="160"/>
+      </w:pPr>
+      <w:r>
+        <w:rPr>
+          <w:rFonts w:ascii="Inter" w:cs="Inter" w:eastAsia="Inter" w:hAnsi="Inter"/>
+          <w:color w:val="1A2A35"/>
+          <w:sz w:val="22"/>
+          <w:szCs w:val="22"/>
+        </w:rPr>
+        <w:t xml:space="preserve">PHASE 2 — Connect with Pascal re: Table Voice integration</w:t>
+      </w:r>
+    </w:p>
+    <w:p>
+      <w:pPr>
+        <w:pStyle w:val="ListParagraph"/>
+        <w:numPr>
+          <w:ilvl w:val="0"/>
+          <w:numId w:val="2"/>
+        </w:numPr>
+        <w:spacing w:after="160"/>
+      </w:pPr>
+      <w:r>
+        <w:rPr>
+          <w:rFonts w:ascii="Inter" w:cs="Inter" w:eastAsia="Inter" w:hAnsi="Inter"/>
+          <w:color w:val="1A2A35"/>
+          <w:sz w:val="22"/>
+          <w:szCs w:val="22"/>
+        </w:rPr>
+        <w:t xml:space="preserve">PHASE 2 — Activate SMS touches across all three segments once A2P approved</w:t>
       </w:r>
     </w:p>
     <w:p>

</xml_diff>